<commit_message>
feat: Update README.md and Report
</commit_message>
<xml_diff>
--- a/slides/Kịch bản thuyết trình DTMF.docx
+++ b/slides/Kịch bản thuyết trình DTMF.docx
@@ -158,7 +158,7 @@
           <w:sz w:val="22"/>
           <w:szCs w:val="22"/>
         </w:rPr>
-        <w:t xml:space="preserve">Khoảng 20 giây · </w:t>
+        <w:t xml:space="preserve">Khoảng 25 giây · </w:t>
       </w:r>
       <w:r>
         <w:rPr>
@@ -192,7 +192,7 @@
           <w:sz w:val="26"/>
           <w:szCs w:val="26"/>
         </w:rPr>
-        <w:t xml:space="preserve">Em chào thầy và các bạn. Em xin đại diện Nhóm 4 trình bày đề tài xây dựng hệ thống phát và giải mã tín hiệu DTMF. Nhóm cài đặt ba cách giải mã là FFT, Goertzel và ngân hàng bộ lọc trên MATLAB, rồi so sánh chúng trên cùng một bộ dữ liệu.</w:t>
+        <w:t xml:space="preserve">Em chào thầy và các bạn. Em xin đại diện Nhóm 4 trình bày đề tài đánh giá so sánh ba phương pháp phân tích phổ trong giải mã tín hiệu DTMF dưới tác động của nhiễu. Nhóm xây dựng hệ thống phát và giải mã DTMF trên MATLAB với ba cách giải mã là FFT, Goertzel và ngân hàng bộ lọc, rồi so sánh chúng trên cùng một bộ dữ liệu.</w:t>
       </w:r>
     </w:p>
     <w:p>
@@ -318,7 +318,7 @@
           <w:sz w:val="26"/>
           <w:szCs w:val="26"/>
         </w:rPr>
-        <w:t xml:space="preserve">Bài trình bày gồm năm phần. Đầu tiên là cấu tạo của tín hiệu DTMF. Tiếp theo là ba cách giải mã và tiêu chí chấp nhận khung dùng chung. Phần ba là phần mềm, gồm ba giao diện MATLAB và một trang web điện thoại. Phần bốn là thực nghiệm về độ bền nhiễu, chi phí tính toán và dung sai tần số. Cuối cùng là kết luận.</w:t>
+        <w:t xml:space="preserve">Bài trình bày gồm năm phần. Đầu tiên là cấu tạo của tín hiệu DTMF. Tiếp theo là ba cách giải mã và luật quyết định dùng chung. Phần ba là phần mềm, gồm ba giao diện MATLAB và một trang web điện thoại. Phần bốn là thực nghiệm về độ bền nhiễu, chi phí tính toán và dung sai tần số. Cuối cùng là kết luận.</w:t>
       </w:r>
     </w:p>
     <w:p>
@@ -456,7 +456,7 @@
           <w:sz w:val="26"/>
           <w:szCs w:val="26"/>
         </w:rPr>
-        <w:t xml:space="preserve">Để đánh giá được bộ giải mã, nhóm mô phỏng trọn một tuyến truyền gồm bốn khối. Bộ phát biến chuỗi phím thành âm thanh. Kênh truyền trộn thêm nhiễu, có thể là nhiễu xè xè kiểu AWGN hoặc nhiễu điện lưới 50 Hz, nghe như tiếng ù. Mức nhiễu được đặt bằng SNR, là tỉ số giữa độ mạnh của tín hiệu và độ mạnh của nhiễu. SNR càng nhỏ thì nhiễu càng lớn. Bộ giải mã nhận âm thanh có nhiễu và trả về chuỗi phím. Cuối cùng, khối đánh giá so chuỗi này với chuỗi gốc. Vì chuỗi gốc luôn được giữ lại, ta biết chính xác bộ giải mã đúng hay sai ở từng phím.</w:t>
+        <w:t xml:space="preserve">Để đánh giá được bộ giải mã, nhóm mô phỏng trọn một tuyến truyền gồm bốn khối. Bộ phát biến chuỗi phím thành âm thanh. Kênh truyền trộn thêm nhiễu, có thể là nhiễu xè xè kiểu AWGN hoặc tiếng ù 50 Hz của điện lưới. Mức nhiễu được đặt bằng SNR, là tỉ số giữa độ mạnh của tín hiệu và độ mạnh của nhiễu. SNR càng nhỏ thì nhiễu càng lớn. Bộ giải mã nhận âm thanh có nhiễu và trả về chuỗi phím. Cuối cùng, khối đánh giá so chuỗi này với chuỗi gốc. Vì chuỗi gốc luôn được giữ lại, ta biết chính xác bộ giải mã đúng hay sai ở từng phím.</w:t>
       </w:r>
     </w:p>
     <w:p>
@@ -657,7 +657,7 @@
           <w:sz w:val="26"/>
           <w:szCs w:val="26"/>
         </w:rPr>
-        <w:t xml:space="preserve">FFT tính cả 256 điểm của phổ, trong khi bộ giải mã chỉ cần biết độ mạnh của 8 tần số. Goertzel bỏ phần tính thừa đó. Thuật toán dùng 8 bộ đếm nhỏ, mỗi bộ phụ trách một tần số. Mỗi mẫu âm thanh đi qua, mỗi bộ chỉ tốn một phép nhân. Hết một khung 205 mẫu, mỗi bộ cho ra độ mạnh của tần số mà nó phụ trách. Nhờ vậy mỗi khung Goertzel chỉ cần 1672 phép nhân, còn FFT cần 4368. Nhóm chọn khung 205 mẫu vì với độ dài này, điểm đo nằm rất sát tần số chuẩn, lệch nhiều nhất 1,36%. Goertzel tốn ít phép nhân hơn FFT khi cần đo dưới 16 tần số, và DTMF chỉ cần 8. Phần lõi Goertzel do nhóm tự viết. Hàm có sẵn của MATLAB chỉ dùng để đối chiếu khi kiểm thử.</w:t>
+        <w:t xml:space="preserve">FFT tính cả 256 điểm của phổ, trong khi bộ giải mã chỉ cần biết độ mạnh của 8 tần số. Goertzel bỏ phần tính thừa đó. Thuật toán dùng 8 bộ đếm nhỏ, mỗi bộ phụ trách một tần số. Mỗi mẫu âm thanh đi qua, mỗi bộ chỉ tốn một phép nhân. Hết một khung 205 mẫu, mỗi bộ cho ra độ mạnh của tần số mà nó phụ trách. Nhờ vậy mỗi khung Goertzel chỉ cần 1672 phép nhân, còn FFT cần 4368. Nhóm chọn khung 205 mẫu vì với độ dài này, điểm đo nằm rất sát tần số chuẩn, lệch nhiều nhất 1,36%. Goertzel rẻ hơn FFT khi cần đo dưới 16 tần số, và DTMF chỉ cần 8. Phần lõi Goertzel do nhóm tự viết. Hàm có sẵn của MATLAB chỉ dùng để đối chiếu khi kiểm thử.</w:t>
       </w:r>
     </w:p>
     <w:p>
@@ -733,7 +733,7 @@
         <w:rPr>
           <w:rFonts w:ascii="Times New Roman" w:cs="Times New Roman" w:eastAsia="Times New Roman" w:hAnsi="Times New Roman"/>
         </w:rPr>
-        <w:t xml:space="preserve">Slide 10. Tiêu chí chấp nhận khung</w:t>
+        <w:t xml:space="preserve">Slide 10. Luật quyết định dùng chung</w:t>
       </w:r>
     </w:p>
     <w:p>
@@ -1173,7 +1173,7 @@
           <w:sz w:val="26"/>
           <w:szCs w:val="26"/>
         </w:rPr>
-        <w:t xml:space="preserve">Đây là phần trình diễn chính. DTMFForensic mô phỏng việc giám định một đoạn ghi âm, trong đó số điện thoại phải được tìm lại chỉ từ âm thanh. Quy trình có bốn bước. Đầu tiên, nhập một số bí mật trên trang web. Trang dựng một đoạn ghi âm có người bấm số đó, lẫn tiếng nói chuyện và nhiễu, rồi gửi âm thanh sang MATLAB. MATLAB đọc dần từng chữ số, hết đoạn thì chạy cả ba bộ giải mã và đưa ra kết luận. Chỉ sau khi MATLAB kết luận, trang mới cho công bố số thật để đối chiếu từng chữ số là đúng, sai, sót hay thừa. Vì không ai biết trước đáp án, kết quả trên màn hình là do MATLAB tự nghe ra.</w:t>
+        <w:t xml:space="preserve">Đây là phần trình diễn chính. DTMFForensic mô phỏng việc giám định một đoạn ghi âm, trong đó số điện thoại phải được tìm lại chỉ từ âm thanh. Quy trình có bốn bước. Thầy nhập một số bí mật trên trang web. Trang dựng một đoạn ghi âm có người bấm số đó, lẫn tiếng nói chuyện và nhiễu, rồi gửi âm thanh sang MATLAB. MATLAB đọc dần từng chữ số, hết đoạn thì chạy cả ba bộ giải mã và đưa ra kết luận. Chỉ sau khi MATLAB kết luận, trang mới cho công bố số thật để đối chiếu từng chữ số là đúng, sai, sót hay thừa. Vì không ai biết trước đáp án, kết quả trên màn hình là do MATLAB tự nghe ra.</w:t>
       </w:r>
     </w:p>
     <w:p>
@@ -1311,7 +1311,7 @@
           <w:sz w:val="26"/>
           <w:szCs w:val="26"/>
         </w:rPr>
-        <w:t xml:space="preserve">Chuyển sang thực nghiệm. Nhóm cho ba bộ giải mã đọc cùng 240 phím, ở 15 mức nhiễu khác nhau và hai loại nhiễu, tổng cộng 5400 lượt giải mã. Độ chính xác được tính từ số phím bị sót, thừa hoặc sai so với chuỗi gốc. Một nghĩa là đúng hết, không nghĩa là sai hết. Biểu đồ đi từ trái sang phải là nhiễu giảm dần. Khi nhiễu vừa phải, từ mức 7,5 dB trở lên, cả ba phương pháp đều đúng 100%. Khác biệt chỉ xuất hiện khi nhiễu rất mạnh. Ở mức 2,5 dB, ngân hàng lọc vẫn đúng 96%, trong khi Goertzel còn 35% và FFT còn 16%. Với nhiễu điện lưới ở cùng mức, ngân hàng lọc đúng hết, còn FFT không đọc được phím nào. Kết quả này ngược với dự đoán ban đầu của nhóm rằng FFT sẽ mạnh nhất.</w:t>
+        <w:t xml:space="preserve">Chuyển sang thực nghiệm. Nhóm cho ba bộ giải mã đọc cùng 240 phím, ở 15 mức nhiễu khác nhau và hai loại nhiễu, tổng cộng 5400 lượt giải mã. Độ chính xác được tính từ số phím bị sót, thừa hoặc sai so với chuỗi gốc. Một nghĩa là đúng hết, không nghĩa là sai hết. Biểu đồ đi từ trái sang phải là nhiễu giảm dần. Khi nhiễu vừa phải, từ mức 7,5 dB trở lên, cả ba phương pháp đều đúng 100%. Khác biệt chỉ xuất hiện khi nhiễu rất mạnh. Ở mức 2,5 dB, ngân hàng lọc vẫn đúng 96%, trong khi Goertzel còn 35% và FFT còn 16%. Với tiếng ù điện lưới ở cùng mức, ngân hàng lọc đúng hết, còn FFT không đọc được phím nào. Kết quả này ngược với dự đoán ban đầu của nhóm rằng FFT sẽ mạnh nhất.</w:t>
       </w:r>
     </w:p>
     <w:p>
@@ -1423,7 +1423,7 @@
           <w:sz w:val="22"/>
           <w:szCs w:val="22"/>
         </w:rPr>
-        <w:t xml:space="preserve">Goertzel tốn ít phép nhân nhất, chỉ bằng một phần tư FFT và một phần mười ngân hàng lọc.</w:t>
+        <w:t xml:space="preserve">Goertzel rẻ nhất, bằng một phần tư FFT và một phần mười ngân hàng lọc.</w:t>
       </w:r>
     </w:p>
     <w:p>
@@ -1549,7 +1549,7 @@
           <w:sz w:val="22"/>
           <w:szCs w:val="22"/>
         </w:rPr>
-        <w:t xml:space="preserve">62/62 tệp đọc đúng. Tệp không được đọc ra phím: FFT, Goertzel 0 phím nhầm, ngân hàng lọc 2 phím nhầm do dao động dư.</w:t>
+        <w:t xml:space="preserve">62/62 tệp đọc đúng. Tệp phải im lặng: FFT, Goertzel 0 phím nhầm, ngân hàng lọc 2 phím nhầm do dư âm.</w:t>
       </w:r>
     </w:p>
     <w:p>
@@ -1563,7 +1563,7 @@
           <w:sz w:val="26"/>
           <w:szCs w:val="26"/>
         </w:rPr>
-        <w:t xml:space="preserve">Các thí nghiệm trước dùng tín hiệu sinh ngay trong máy, và khoảng nghỉ giữa hai phím là im lặng tuyệt đối. Để thử những tình huống gần thực tế hơn, nhóm dựng thêm một bộ 139 tệp âm thanh có nhãn. Bộ này gồm cả giọng tổng đài thu thật, người bấm tay giữa tiếng ồn, phím giữ lâu hoặc bấm vội, tám định dạng tệp khác nhau, và 14 tệp hoàn toàn không có phím như âm mời quay số, âm báo bận hay giọng nói. Mỗi tệp được mở đúng như khi bấm nút mở tệp trong DTMFApp. Kết quả là cả ba bộ giải mã đọc đúng toàn bộ 62 tệp phải đọc đúng. Với 18 tệp không được đọc ra phím nào, FFT và Goertzel không đọc ra phím nào, kể cả với 18 giây giọng nói thật. Ngân hàng lọc thì đọc nhầm 2 phím. Nguyên nhân là dao động dư. Khi âm thanh vừa tắt, bộ lọc vẫn còn ngân thêm một lúc ở đúng tần số của nó, nên chương trình tưởng vẫn còn phím. Với phím thật thì dao động dư này vô hại, nhưng với giọng nói hay âm lệch tần, nó tạo ra một phím không có thật. Đây là hạn chế mới mà nhóm phát hiện nhờ bộ dữ liệu này.</w:t>
+        <w:t xml:space="preserve">Các thí nghiệm trước dùng tín hiệu sinh ngay trong máy, và khoảng nghỉ giữa hai phím là im lặng tuyệt đối. Để thử những tình huống gần thực tế hơn, nhóm dựng thêm một bộ 139 tệp âm thanh có nhãn. Bộ này gồm cả giọng tổng đài thu thật, người bấm tay giữa tiếng ồn, phím giữ lâu hoặc bấm vội, tám định dạng tệp khác nhau, và 14 tệp hoàn toàn không có phím như âm mời quay số, âm báo bận hay giọng nói. Mỗi tệp được mở đúng như khi bấm nút mở tệp trong DTMFApp. Kết quả là cả ba bộ giải mã đọc đúng toàn bộ 62 tệp phải đọc đúng. Với 18 tệp phải im lặng, FFT và Goertzel không đọc ra phím nào, kể cả với 18 giây giọng nói thật. Ngân hàng lọc thì đọc nhầm 2 phím. Nguyên nhân là dư âm. Khi âm thanh vừa tắt, bộ lọc vẫn còn ngân thêm một lúc ở đúng tần số của nó, nên chương trình tưởng vẫn còn phím. Với phím thật thì dư âm này vô hại, nhưng với giọng nói hay âm lệch tần, nó tạo ra một phím không có thật. Đây là hạn chế mới mà nhóm phát hiện nhờ bộ dữ liệu này.</w:t>
       </w:r>
     </w:p>
     <w:p>
@@ -1624,7 +1624,7 @@
           <w:sz w:val="22"/>
           <w:szCs w:val="22"/>
         </w:rPr>
-        <w:t xml:space="preserve">Goertzel tiết kiệm phép tính, ngân hàng lọc bền nhiễu, FFT cho phổ đầy đủ.</w:t>
+        <w:t xml:space="preserve">Goertzel rẻ, ngân hàng lọc bền nhiễu, FFT cho phổ đầy đủ.</w:t>
       </w:r>
     </w:p>
     <w:p>
@@ -1638,7 +1638,7 @@
           <w:sz w:val="26"/>
           <w:szCs w:val="26"/>
         </w:rPr>
-        <w:t xml:space="preserve">Từ các kết quả trên, không có phương pháp nào tốt nhất ở mọi mặt, nên lựa chọn phụ thuộc vào ứng dụng. Goertzel hợp với thiết bị nhúng ít tài nguyên vì tốn ít phép nhân nhất, và mỗi điểm đo chỉ cần nhớ hai số. Ngân hàng lọc hợp với môi trường nhiễu mạnh, nhất là nhiễu điện lưới, đổi lại chi phí cao nhất và có thể sinh phím giả từ dao động dư. FFT dễ cài đặt nhất và cho phổ đầy đủ, nên hợp khi cùng một bộ thu phải phát hiện thêm các tín hiệu khác ngoài DTMF.</w:t>
+        <w:t xml:space="preserve">Từ các kết quả trên, không có phương pháp nào tốt nhất ở mọi mặt, nên lựa chọn phụ thuộc vào ứng dụng. Goertzel hợp với thiết bị nhúng ít tài nguyên vì rẻ nhất, và mỗi điểm đo chỉ cần nhớ hai số. Ngân hàng lọc hợp với môi trường nhiễu mạnh, nhất là nhiễu ù điện lưới, đổi lại chi phí cao nhất và có thể sinh phím giả từ dư âm. FFT dễ cài đặt nhất và cho phổ đầy đủ, nên hợp khi cùng một bộ thu phải phát hiện thêm các tín hiệu khác ngoài DTMF.</w:t>
       </w:r>
     </w:p>
     <w:p>
@@ -1701,7 +1701,7 @@
           <w:sz w:val="26"/>
           <w:szCs w:val="26"/>
         </w:rPr>
-        <w:t xml:space="preserve">Tóm lại, nhóm đã xây dựng bộ phát DTMF theo chuẩn kèm bộ cộng nhiễu đúng SNR, cùng ba bộ giải mã dùng chung một tiêu chí chấp nhận khung và đều đúng 100% từ 7,5 dB. Phần mềm có ba giao diện cho khảo sát, tổng đài và giám định. Nhóm còn thử thêm trên 139 tệp âm thanh có nhãn, và kiểm tra tự động bằng 266 ca MATLAB và 63 ca web. Về hạn chế, thực nghiệm chính mới dùng dữ liệu tổng hợp, giọng nói thật mới có một giọng dài 18 giây, chuẩn Q.24 mới đạt một phần, và ngân hàng lọc còn sinh phím giả từ dao động dư. Hướng phát triển quan trọng nhất là cho mốc 70% tự điều chỉnh theo mức nhiễu nền, rồi thử với nhiều giọng nói thật hơn. Tiếp theo là cho Goertzel đo đúng tại tần số chuẩn để đạt dung sai 1,5%, chặn phím giả do dao động dư của bộ lọc, và đưa Goertzel lên chạy trên vi điều khiển.</w:t>
+        <w:t xml:space="preserve">Tóm lại, nhóm đã xây dựng bộ phát DTMF theo chuẩn kèm bộ cộng nhiễu đúng SNR, cùng ba bộ giải mã dùng chung một luật quyết định và đều đúng 100% từ 7,5 dB. Phần mềm có ba giao diện cho khảo sát, tổng đài và giám định. Nhóm còn thử thêm trên 139 tệp âm thanh có nhãn, và kiểm tra tự động bằng 266 ca MATLAB và 63 ca web. Về hạn chế, thực nghiệm chính mới dùng dữ liệu tổng hợp, giọng nói thật mới có một giọng dài 18 giây, chuẩn Q.24 mới đạt một phần, và ngân hàng lọc còn sinh phím giả từ dư âm. Hướng phát triển quan trọng nhất là cho mốc 70% tự điều chỉnh theo mức nhiễu nền, rồi thử với nhiều giọng nói thật hơn. Tiếp theo là cho Goertzel đo đúng tại tần số chuẩn để đạt dung sai 1,5%, chặn phím giả do dư âm của bộ lọc, và đưa Goertzel lên chạy trên vi điều khiển.</w:t>
       </w:r>
     </w:p>
     <w:p>
@@ -2340,7 +2340,7 @@
                 <w:sz w:val="24"/>
                 <w:szCs w:val="24"/>
               </w:rPr>
-              <w:t xml:space="preserve">Điều kiện bốn của tiêu chí chấp nhận khung. 7 tần số chuẩn phải chiếm ít nhất 70% năng lượng của khung, nếu không khung bị coi là nhiễu.</w:t>
+              <w:t xml:space="preserve">Điều kiện bốn của luật quyết định. 7 tần số chuẩn phải chiếm ít nhất 70% năng lượng của khung, nếu không khung bị coi là nhiễu.</w:t>
             </w:r>
           </w:p>
         </w:tc>
@@ -2491,7 +2491,7 @@
                 <w:sz w:val="24"/>
                 <w:szCs w:val="24"/>
               </w:rPr>
-              <w:t xml:space="preserve">AWGN, nhiễu điện lưới 50 Hz</w:t>
+              <w:t xml:space="preserve">AWGN, nhiễu ù 50 Hz</w:t>
             </w:r>
           </w:p>
         </w:tc>
@@ -2520,7 +2520,7 @@
                 <w:sz w:val="24"/>
                 <w:szCs w:val="24"/>
               </w:rPr>
-              <w:t xml:space="preserve">AWGN là nhiễu xè xè trải đều mọi tần số. Nhiễu điện lưới là dao động 50 Hz từ lưới điện, nghe như tiếng ù.</w:t>
+              <w:t xml:space="preserve">AWGN là nhiễu xè xè trải đều mọi tần số. Nhiễu ù là tiếng ù của điện lưới ở 50 Hz.</w:t>
             </w:r>
           </w:p>
         </w:tc>
@@ -2872,7 +2872,7 @@
           <w:sz w:val="26"/>
           <w:szCs w:val="26"/>
         </w:rPr>
-        <w:t xml:space="preserve">Bộ lọc cộng hưởng còn ngân thêm một lúc sau khi âm thanh tắt. Ngay lúc đó năng lượng của khung gần bằng 0 nhưng bộ lọc vẫn còn dao động, nên khung vượt mốc 70% dù không có phím. Với phím thật, dao động dư chỉ kéo dài chính phím đó nên vô hại. Với giọng nói hay âm lệch tần, nó sinh ra một phím không có thật. FFT và Goertzel không bị vì không giữ lại gì giữa các khung. Hướng sửa là loại khung có tỉ lệ năng lượng vượt hẳn 100%, hoặc tính năng lượng khung trên đoạn dài hơn.</w:t>
+        <w:t xml:space="preserve">Bộ lọc cộng hưởng còn ngân thêm một lúc sau khi âm thanh tắt. Ngay lúc đó năng lượng của khung gần bằng 0 nhưng bộ lọc vẫn còn dao động, nên khung vượt mốc 70% dù không có phím. Với phím thật, dư âm chỉ kéo dài chính phím đó nên vô hại. Với giọng nói hay âm lệch tần, nó sinh ra một phím không có thật. FFT và Goertzel không bị vì không giữ lại gì giữa các khung. Hướng sửa là loại khung có tỉ lệ năng lượng vượt hẳn 100%, hoặc tính năng lượng khung trên đoạn dài hơn.</w:t>
       </w:r>
     </w:p>
     <w:p>

</xml_diff>